<commit_message>
add notes article 2 et 3
</commit_message>
<xml_diff>
--- a/notes/notes_article1_cedric.docx
+++ b/notes/notes_article1_cedric.docx
@@ -45,7 +45,11 @@
         <w:t xml:space="preserve"> </w:t>
       </w:r>
     </w:p>
-    <w:p/>
+    <w:p>
+      <w:r>
+        <w:t>19 avril 2023</w:t>
+      </w:r>
+    </w:p>
     <w:p>
       <w:pPr>
         <w:pStyle w:val="Titre3"/>
@@ -548,16 +552,16 @@
           <w:rFonts w:ascii="Arial" w:eastAsia="Times New Roman" w:hAnsi="Arial" w:cs="Times New Roman"/>
           <w:color w:val="000000"/>
           <w:kern w:val="0"/>
-          <w:lang w:val="en-US" w:eastAsia="fr-FR"/>
-          <w14:ligatures w14:val="none"/>
-        </w:rPr>
-      </w:pPr>
-      <w:r>
-        <w:rPr>
-          <w:rFonts w:ascii="Arial" w:eastAsia="Times New Roman" w:hAnsi="Arial" w:cs="Times New Roman"/>
-          <w:color w:val="000000"/>
-          <w:kern w:val="0"/>
-          <w:lang w:val="en-US" w:eastAsia="fr-FR"/>
+          <w:lang w:eastAsia="fr-FR"/>
+          <w14:ligatures w14:val="none"/>
+        </w:rPr>
+      </w:pPr>
+      <w:r>
+        <w:rPr>
+          <w:rFonts w:ascii="Arial" w:eastAsia="Times New Roman" w:hAnsi="Arial" w:cs="Times New Roman"/>
+          <w:color w:val="000000"/>
+          <w:kern w:val="0"/>
+          <w:lang w:eastAsia="fr-FR"/>
           <w14:ligatures w14:val="none"/>
         </w:rPr>
         <w:br w:type="page"/>
@@ -1878,7 +1882,7 @@
           <w:bCs/>
           <w:color w:val="000000"/>
           <w:kern w:val="0"/>
-          <w:lang w:val="en-US" w:eastAsia="fr-FR"/>
+          <w:lang w:eastAsia="fr-FR"/>
           <w14:ligatures w14:val="none"/>
         </w:rPr>
       </w:pPr>
@@ -1889,7 +1893,7 @@
           <w:bCs/>
           <w:color w:val="000000"/>
           <w:kern w:val="0"/>
-          <w:lang w:val="en-US" w:eastAsia="fr-FR"/>
+          <w:lang w:eastAsia="fr-FR"/>
           <w14:ligatures w14:val="none"/>
         </w:rPr>
         <w:br w:type="page"/>
@@ -1956,7 +1960,7 @@
           <w:lang w:val="en-US" w:eastAsia="fr-FR"/>
         </w:rPr>
         <w:drawing>
-          <wp:inline distT="0" distB="0" distL="0" distR="0" wp14:anchorId="05ACC86D" wp14:editId="7276ED75">
+          <wp:inline distT="0" distB="0" distL="0" distR="0" wp14:anchorId="05ACC86D" wp14:editId="2D30FCFA">
             <wp:extent cx="5760720" cy="2435860"/>
             <wp:effectExtent l="0" t="0" r="5080" b="0"/>
             <wp:docPr id="1245917932" name="Image 4"/>
@@ -5741,20 +5745,1087 @@
       <w:pPr>
         <w:pStyle w:val="Titre3"/>
         <w:rPr>
-          <w:rFonts w:eastAsia="Times New Roman"/>
-          <w:lang w:eastAsia="fr-FR"/>
-        </w:rPr>
-      </w:pPr>
-      <w:r>
-        <w:rPr>
-          <w:rFonts w:eastAsia="Times New Roman"/>
-          <w:lang w:eastAsia="fr-FR"/>
-        </w:rPr>
-        <w:t>L'Innovation Opérationnelle : Le Masquage Spatial Multi-Blocs</w:t>
-      </w:r>
+          <w:rStyle w:val="Accentuationlgre"/>
+        </w:rPr>
+      </w:pPr>
+      <w:r>
+        <w:rPr>
+          <w:rStyle w:val="Accentuationlgre"/>
+        </w:rPr>
+        <w:t xml:space="preserve">Forward </w:t>
+      </w:r>
+      <w:proofErr w:type="spellStart"/>
+      <w:r>
+        <w:rPr>
+          <w:rStyle w:val="Accentuationlgre"/>
+        </w:rPr>
+        <w:t>Pass</w:t>
+      </w:r>
+      <w:proofErr w:type="spellEnd"/>
     </w:p>
     <w:p>
       <w:pPr>
+        <w:pStyle w:val="NormalWeb"/>
+        <w:spacing w:before="0" w:beforeAutospacing="0"/>
+        <w:rPr>
+          <w:rFonts w:ascii="Arial" w:hAnsi="Arial" w:cs="Arial"/>
+          <w:color w:val="000000"/>
+        </w:rPr>
+      </w:pPr>
+      <w:r>
+        <w:rPr>
+          <w:rFonts w:ascii="Arial" w:hAnsi="Arial" w:cs="Arial"/>
+          <w:color w:val="000000"/>
+        </w:rPr>
+        <w:t>Soit</w:t>
+      </w:r>
+      <w:r>
+        <w:rPr>
+          <w:rFonts w:ascii="Arial" w:hAnsi="Arial" w:cs="Arial"/>
+        </w:rPr>
+        <w:t> </w:t>
+      </w:r>
+      <m:oMath>
+        <m:r>
+          <m:rPr>
+            <m:scr m:val="script"/>
+            <m:sty m:val="p"/>
+          </m:rPr>
+          <w:rPr>
+            <w:rFonts w:ascii="Cambria Math" w:hAnsi="Cambria Math" w:cs="Arial"/>
+          </w:rPr>
+          <m:t>I</m:t>
+        </m:r>
+      </m:oMath>
+      <w:r>
+        <w:rPr>
+          <w:rFonts w:ascii="Arial" w:hAnsi="Arial" w:cs="Arial"/>
+        </w:rPr>
+        <w:t> </w:t>
+      </w:r>
+      <w:r>
+        <w:rPr>
+          <w:rFonts w:ascii="Arial" w:hAnsi="Arial" w:cs="Arial"/>
+          <w:color w:val="000000"/>
+        </w:rPr>
+        <w:t>l'image initiale.</w:t>
+      </w:r>
+    </w:p>
+    <w:p>
+      <w:pPr>
+        <w:pStyle w:val="NormalWeb"/>
+        <w:numPr>
+          <w:ilvl w:val="0"/>
+          <w:numId w:val="9"/>
+        </w:numPr>
+        <w:spacing w:before="0" w:beforeAutospacing="0"/>
+        <w:rPr>
+          <w:rFonts w:ascii="Arial" w:hAnsi="Arial" w:cs="Arial"/>
+          <w:color w:val="000000"/>
+        </w:rPr>
+      </w:pPr>
+      <w:r>
+        <w:rPr>
+          <w:rFonts w:ascii="Arial" w:hAnsi="Arial" w:cs="Arial"/>
+          <w:color w:val="000000"/>
+        </w:rPr>
+        <w:t>Les patches de contexte sont</w:t>
+      </w:r>
+      <w:r>
+        <w:rPr>
+          <w:rFonts w:ascii="Arial" w:hAnsi="Arial" w:cs="Arial"/>
+        </w:rPr>
+        <w:t> </w:t>
+      </w:r>
+      <m:oMath>
+        <m:r>
+          <w:rPr>
+            <w:rFonts w:ascii="Cambria Math" w:hAnsi="Cambria Math" w:cs="Arial"/>
+          </w:rPr>
+          <m:t>x=</m:t>
+        </m:r>
+        <m:sSub>
+          <m:sSubPr>
+            <m:ctrlPr>
+              <w:rPr>
+                <w:rFonts w:ascii="Cambria Math" w:hAnsi="Cambria Math" w:cs="Arial"/>
+              </w:rPr>
+            </m:ctrlPr>
+          </m:sSubPr>
+          <m:e>
+            <m:d>
+              <m:dPr>
+                <m:begChr m:val="{"/>
+                <m:endChr m:val="}"/>
+                <m:ctrlPr>
+                  <w:rPr>
+                    <w:rFonts w:ascii="Cambria Math" w:hAnsi="Cambria Math" w:cs="Arial"/>
+                  </w:rPr>
+                </m:ctrlPr>
+              </m:dPr>
+              <m:e>
+                <m:sSub>
+                  <m:sSubPr>
+                    <m:ctrlPr>
+                      <w:rPr>
+                        <w:rFonts w:ascii="Cambria Math" w:hAnsi="Cambria Math" w:cs="Arial"/>
+                      </w:rPr>
+                    </m:ctrlPr>
+                  </m:sSubPr>
+                  <m:e>
+                    <m:r>
+                      <w:rPr>
+                        <w:rFonts w:ascii="Cambria Math" w:hAnsi="Cambria Math" w:cs="Arial"/>
+                      </w:rPr>
+                      <m:t>p</m:t>
+                    </m:r>
+                  </m:e>
+                  <m:sub>
+                    <m:r>
+                      <w:rPr>
+                        <w:rFonts w:ascii="Cambria Math" w:hAnsi="Cambria Math" w:cs="Arial"/>
+                      </w:rPr>
+                      <m:t>i</m:t>
+                    </m:r>
+                  </m:sub>
+                </m:sSub>
+              </m:e>
+            </m:d>
+          </m:e>
+          <m:sub>
+            <m:r>
+              <w:rPr>
+                <w:rFonts w:ascii="Cambria Math" w:hAnsi="Cambria Math" w:cs="Arial"/>
+              </w:rPr>
+              <m:t>i∈C</m:t>
+            </m:r>
+          </m:sub>
+        </m:sSub>
+      </m:oMath>
+      <w:r>
+        <w:rPr>
+          <w:rFonts w:ascii="Arial" w:hAnsi="Arial" w:cs="Arial"/>
+        </w:rPr>
+        <w:t> </w:t>
+      </w:r>
+      <w:r>
+        <w:rPr>
+          <w:rFonts w:ascii="Arial" w:hAnsi="Arial" w:cs="Arial"/>
+          <w:color w:val="000000"/>
+        </w:rPr>
+        <w:t>où</w:t>
+      </w:r>
+      <w:r>
+        <w:rPr>
+          <w:rFonts w:ascii="Arial" w:hAnsi="Arial" w:cs="Arial"/>
+        </w:rPr>
+        <w:t> </w:t>
+      </w:r>
+      <m:oMath>
+        <m:r>
+          <w:rPr>
+            <w:rFonts w:ascii="Cambria Math" w:hAnsi="Cambria Math" w:cs="Arial"/>
+          </w:rPr>
+          <m:t>C</m:t>
+        </m:r>
+      </m:oMath>
+      <w:r>
+        <w:rPr>
+          <w:rFonts w:ascii="Arial" w:hAnsi="Arial" w:cs="Arial"/>
+        </w:rPr>
+        <w:t> </w:t>
+      </w:r>
+      <w:r>
+        <w:rPr>
+          <w:rFonts w:ascii="Arial" w:hAnsi="Arial" w:cs="Arial"/>
+          <w:color w:val="000000"/>
+        </w:rPr>
+        <w:t>est l'ensemble des indices de contexte.</w:t>
+      </w:r>
+    </w:p>
+    <w:p>
+      <w:pPr>
+        <w:pStyle w:val="NormalWeb"/>
+        <w:numPr>
+          <w:ilvl w:val="0"/>
+          <w:numId w:val="9"/>
+        </w:numPr>
+        <w:spacing w:before="0" w:beforeAutospacing="0"/>
+        <w:rPr>
+          <w:rFonts w:ascii="Arial" w:hAnsi="Arial" w:cs="Arial"/>
+          <w:color w:val="000000"/>
+        </w:rPr>
+      </w:pPr>
+      <w:r>
+        <w:rPr>
+          <w:rFonts w:ascii="Arial" w:hAnsi="Arial" w:cs="Arial"/>
+          <w:color w:val="000000"/>
+        </w:rPr>
+        <w:t>Les patches cibles sont divisés en</w:t>
+      </w:r>
+      <w:r>
+        <w:rPr>
+          <w:rFonts w:ascii="Arial" w:hAnsi="Arial" w:cs="Arial"/>
+        </w:rPr>
+        <w:t> </w:t>
+      </w:r>
+      <m:oMath>
+        <m:r>
+          <w:rPr>
+            <w:rFonts w:ascii="Cambria Math" w:hAnsi="Cambria Math" w:cs="Arial"/>
+          </w:rPr>
+          <m:t>K</m:t>
+        </m:r>
+      </m:oMath>
+      <w:r>
+        <w:rPr>
+          <w:rFonts w:ascii="Arial" w:hAnsi="Arial" w:cs="Arial"/>
+        </w:rPr>
+        <w:t> </w:t>
+      </w:r>
+      <w:r>
+        <w:rPr>
+          <w:rFonts w:ascii="Arial" w:hAnsi="Arial" w:cs="Arial"/>
+          <w:color w:val="000000"/>
+        </w:rPr>
+        <w:t>blocs :</w:t>
+      </w:r>
+      <w:r>
+        <w:rPr>
+          <w:rFonts w:ascii="Arial" w:hAnsi="Arial" w:cs="Arial"/>
+        </w:rPr>
+        <w:t> </w:t>
+      </w:r>
+      <m:oMath>
+        <m:sSub>
+          <m:sSubPr>
+            <m:ctrlPr>
+              <w:rPr>
+                <w:rFonts w:ascii="Cambria Math" w:hAnsi="Cambria Math" w:cs="Arial"/>
+              </w:rPr>
+            </m:ctrlPr>
+          </m:sSubPr>
+          <m:e>
+            <m:r>
+              <w:rPr>
+                <w:rFonts w:ascii="Cambria Math" w:hAnsi="Cambria Math" w:cs="Arial"/>
+              </w:rPr>
+              <m:t>y</m:t>
+            </m:r>
+          </m:e>
+          <m:sub>
+            <m:r>
+              <w:rPr>
+                <w:rFonts w:ascii="Cambria Math" w:hAnsi="Cambria Math" w:cs="Arial"/>
+              </w:rPr>
+              <m:t>k</m:t>
+            </m:r>
+          </m:sub>
+        </m:sSub>
+        <m:r>
+          <w:rPr>
+            <w:rFonts w:ascii="Cambria Math" w:hAnsi="Cambria Math" w:cs="Arial"/>
+          </w:rPr>
+          <m:t>=</m:t>
+        </m:r>
+        <m:sSub>
+          <m:sSubPr>
+            <m:ctrlPr>
+              <w:rPr>
+                <w:rFonts w:ascii="Cambria Math" w:hAnsi="Cambria Math" w:cs="Arial"/>
+              </w:rPr>
+            </m:ctrlPr>
+          </m:sSubPr>
+          <m:e>
+            <m:d>
+              <m:dPr>
+                <m:begChr m:val="{"/>
+                <m:endChr m:val="}"/>
+                <m:ctrlPr>
+                  <w:rPr>
+                    <w:rFonts w:ascii="Cambria Math" w:hAnsi="Cambria Math" w:cs="Arial"/>
+                  </w:rPr>
+                </m:ctrlPr>
+              </m:dPr>
+              <m:e>
+                <m:sSub>
+                  <m:sSubPr>
+                    <m:ctrlPr>
+                      <w:rPr>
+                        <w:rFonts w:ascii="Cambria Math" w:hAnsi="Cambria Math" w:cs="Arial"/>
+                      </w:rPr>
+                    </m:ctrlPr>
+                  </m:sSubPr>
+                  <m:e>
+                    <m:r>
+                      <w:rPr>
+                        <w:rFonts w:ascii="Cambria Math" w:hAnsi="Cambria Math" w:cs="Arial"/>
+                      </w:rPr>
+                      <m:t>p</m:t>
+                    </m:r>
+                  </m:e>
+                  <m:sub>
+                    <m:r>
+                      <w:rPr>
+                        <w:rFonts w:ascii="Cambria Math" w:hAnsi="Cambria Math" w:cs="Arial"/>
+                      </w:rPr>
+                      <m:t>j</m:t>
+                    </m:r>
+                  </m:sub>
+                </m:sSub>
+              </m:e>
+            </m:d>
+          </m:e>
+          <m:sub>
+            <m:r>
+              <w:rPr>
+                <w:rFonts w:ascii="Cambria Math" w:hAnsi="Cambria Math" w:cs="Arial"/>
+              </w:rPr>
+              <m:t>j∈</m:t>
+            </m:r>
+            <m:sSub>
+              <m:sSubPr>
+                <m:ctrlPr>
+                  <w:rPr>
+                    <w:rFonts w:ascii="Cambria Math" w:hAnsi="Cambria Math" w:cs="Arial"/>
+                  </w:rPr>
+                </m:ctrlPr>
+              </m:sSubPr>
+              <m:e>
+                <m:r>
+                  <w:rPr>
+                    <w:rFonts w:ascii="Cambria Math" w:hAnsi="Cambria Math" w:cs="Arial"/>
+                  </w:rPr>
+                  <m:t>B</m:t>
+                </m:r>
+              </m:e>
+              <m:sub>
+                <m:r>
+                  <w:rPr>
+                    <w:rFonts w:ascii="Cambria Math" w:hAnsi="Cambria Math" w:cs="Arial"/>
+                  </w:rPr>
+                  <m:t>k</m:t>
+                </m:r>
+              </m:sub>
+            </m:sSub>
+          </m:sub>
+        </m:sSub>
+      </m:oMath>
+      <w:r>
+        <w:rPr>
+          <w:rFonts w:ascii="Arial" w:hAnsi="Arial" w:cs="Arial"/>
+          <w:color w:val="000000"/>
+        </w:rPr>
+        <w:t>.</w:t>
+      </w:r>
+    </w:p>
+    <w:p>
+      <w:pPr>
+        <w:pStyle w:val="NormalWeb"/>
+        <w:numPr>
+          <w:ilvl w:val="0"/>
+          <w:numId w:val="9"/>
+        </w:numPr>
+        <w:spacing w:before="0" w:beforeAutospacing="0"/>
+        <w:rPr>
+          <w:rFonts w:ascii="Arial" w:hAnsi="Arial" w:cs="Arial"/>
+          <w:color w:val="000000"/>
+        </w:rPr>
+      </w:pPr>
+      <w:r>
+        <w:rPr>
+          <w:rFonts w:ascii="Arial" w:hAnsi="Arial" w:cs="Arial"/>
+          <w:color w:val="000000"/>
+        </w:rPr>
+        <w:t>Représentation du contexte :</w:t>
+      </w:r>
+    </w:p>
+    <w:p>
+      <w:pPr>
+        <w:pStyle w:val="NormalWeb"/>
+        <w:numPr>
+          <w:ilvl w:val="0"/>
+          <w:numId w:val="9"/>
+        </w:numPr>
+        <w:spacing w:before="0" w:beforeAutospacing="0"/>
+        <w:rPr>
+          <w:rFonts w:ascii="Arial" w:hAnsi="Arial" w:cs="Arial"/>
+          <w:color w:val="000000"/>
+        </w:rPr>
+      </w:pPr>
+      <m:oMath>
+        <m:sSub>
+          <m:sSubPr>
+            <m:ctrlPr>
+              <w:rPr>
+                <w:rFonts w:ascii="Cambria Math" w:hAnsi="Cambria Math" w:cs="Arial"/>
+              </w:rPr>
+            </m:ctrlPr>
+          </m:sSubPr>
+          <m:e>
+            <m:r>
+              <w:rPr>
+                <w:rFonts w:ascii="Cambria Math" w:hAnsi="Cambria Math" w:cs="Arial"/>
+              </w:rPr>
+              <m:t>s</m:t>
+            </m:r>
+          </m:e>
+          <m:sub>
+            <m:r>
+              <w:rPr>
+                <w:rFonts w:ascii="Cambria Math" w:hAnsi="Cambria Math" w:cs="Arial"/>
+              </w:rPr>
+              <m:t>x</m:t>
+            </m:r>
+          </m:sub>
+        </m:sSub>
+        <m:r>
+          <w:rPr>
+            <w:rFonts w:ascii="Cambria Math" w:hAnsi="Cambria Math" w:cs="Arial"/>
+          </w:rPr>
+          <m:t>=</m:t>
+        </m:r>
+        <m:sSub>
+          <m:sSubPr>
+            <m:ctrlPr>
+              <w:rPr>
+                <w:rFonts w:ascii="Cambria Math" w:hAnsi="Cambria Math" w:cs="Arial"/>
+              </w:rPr>
+            </m:ctrlPr>
+          </m:sSubPr>
+          <m:e>
+            <m:r>
+              <w:rPr>
+                <w:rFonts w:ascii="Cambria Math" w:hAnsi="Cambria Math" w:cs="Arial"/>
+              </w:rPr>
+              <m:t>E</m:t>
+            </m:r>
+          </m:e>
+          <m:sub>
+            <m:r>
+              <w:rPr>
+                <w:rFonts w:ascii="Cambria Math" w:hAnsi="Cambria Math" w:cs="Arial"/>
+              </w:rPr>
+              <m:t>θ</m:t>
+            </m:r>
+          </m:sub>
+        </m:sSub>
+        <m:d>
+          <m:dPr>
+            <m:ctrlPr>
+              <w:rPr>
+                <w:rFonts w:ascii="Cambria Math" w:hAnsi="Cambria Math" w:cs="Arial"/>
+              </w:rPr>
+            </m:ctrlPr>
+          </m:dPr>
+          <m:e>
+            <m:r>
+              <w:rPr>
+                <w:rFonts w:ascii="Cambria Math" w:hAnsi="Cambria Math" w:cs="Arial"/>
+              </w:rPr>
+              <m:t>x</m:t>
+            </m:r>
+          </m:e>
+        </m:d>
+      </m:oMath>
+      <w:r>
+        <w:rPr>
+          <w:rFonts w:ascii="Arial" w:hAnsi="Arial" w:cs="Arial"/>
+          <w:color w:val="000000"/>
+        </w:rPr>
+        <w:br/>
+      </w:r>
+      <w:r>
+        <w:rPr>
+          <w:rFonts w:ascii="Arial" w:hAnsi="Arial" w:cs="Arial"/>
+          <w:color w:val="000000"/>
+        </w:rPr>
+        <w:t>Représentations cibles (Calculées pour chaque patch cible</w:t>
+      </w:r>
+      <w:r>
+        <w:rPr>
+          <w:rFonts w:ascii="Arial" w:hAnsi="Arial" w:cs="Arial"/>
+        </w:rPr>
+        <w:t> </w:t>
+      </w:r>
+      <m:oMath>
+        <m:r>
+          <w:rPr>
+            <w:rFonts w:ascii="Cambria Math" w:hAnsi="Cambria Math" w:cs="Arial"/>
+          </w:rPr>
+          <m:t>j</m:t>
+        </m:r>
+      </m:oMath>
+      <w:r>
+        <w:rPr>
+          <w:rFonts w:ascii="Arial" w:hAnsi="Arial" w:cs="Arial"/>
+          <w:color w:val="000000"/>
+        </w:rPr>
+        <w:t>) :</w:t>
+      </w:r>
+    </w:p>
+    <w:p>
+      <w:pPr>
+        <w:pStyle w:val="NormalWeb"/>
+        <w:numPr>
+          <w:ilvl w:val="0"/>
+          <w:numId w:val="9"/>
+        </w:numPr>
+        <w:spacing w:before="0" w:beforeAutospacing="0"/>
+        <w:rPr>
+          <w:rFonts w:ascii="Arial" w:hAnsi="Arial" w:cs="Arial"/>
+          <w:color w:val="000000"/>
+        </w:rPr>
+      </w:pPr>
+      <m:oMath>
+        <m:sSub>
+          <m:sSubPr>
+            <m:ctrlPr>
+              <w:rPr>
+                <w:rFonts w:ascii="Cambria Math" w:hAnsi="Cambria Math" w:cs="Arial"/>
+              </w:rPr>
+            </m:ctrlPr>
+          </m:sSubPr>
+          <m:e>
+            <m:r>
+              <w:rPr>
+                <w:rFonts w:ascii="Cambria Math" w:hAnsi="Cambria Math" w:cs="Arial"/>
+              </w:rPr>
+              <m:t>s</m:t>
+            </m:r>
+          </m:e>
+          <m:sub>
+            <m:r>
+              <w:rPr>
+                <w:rFonts w:ascii="Cambria Math" w:hAnsi="Cambria Math" w:cs="Arial"/>
+              </w:rPr>
+              <m:t>y,j</m:t>
+            </m:r>
+          </m:sub>
+        </m:sSub>
+        <m:r>
+          <w:rPr>
+            <w:rFonts w:ascii="Cambria Math" w:hAnsi="Cambria Math" w:cs="Arial"/>
+          </w:rPr>
+          <m:t>=</m:t>
+        </m:r>
+        <m:sSub>
+          <m:sSubPr>
+            <m:ctrlPr>
+              <w:rPr>
+                <w:rFonts w:ascii="Cambria Math" w:hAnsi="Cambria Math" w:cs="Arial"/>
+              </w:rPr>
+            </m:ctrlPr>
+          </m:sSubPr>
+          <m:e>
+            <m:r>
+              <w:rPr>
+                <w:rFonts w:ascii="Cambria Math" w:hAnsi="Cambria Math" w:cs="Arial"/>
+              </w:rPr>
+              <m:t>E</m:t>
+            </m:r>
+          </m:e>
+          <m:sub>
+            <m:acc>
+              <m:accPr>
+                <m:chr m:val="̅"/>
+                <m:ctrlPr>
+                  <w:rPr>
+                    <w:rFonts w:ascii="Cambria Math" w:hAnsi="Cambria Math" w:cs="Arial"/>
+                  </w:rPr>
+                </m:ctrlPr>
+              </m:accPr>
+              <m:e>
+                <m:r>
+                  <w:rPr>
+                    <w:rFonts w:ascii="Cambria Math" w:hAnsi="Cambria Math" w:cs="Arial"/>
+                  </w:rPr>
+                  <m:t>θ</m:t>
+                </m:r>
+              </m:e>
+            </m:acc>
+          </m:sub>
+        </m:sSub>
+        <m:d>
+          <m:dPr>
+            <m:ctrlPr>
+              <w:rPr>
+                <w:rFonts w:ascii="Cambria Math" w:hAnsi="Cambria Math" w:cs="Arial"/>
+              </w:rPr>
+            </m:ctrlPr>
+          </m:dPr>
+          <m:e>
+            <m:sSub>
+              <m:sSubPr>
+                <m:ctrlPr>
+                  <w:rPr>
+                    <w:rFonts w:ascii="Cambria Math" w:hAnsi="Cambria Math" w:cs="Arial"/>
+                  </w:rPr>
+                </m:ctrlPr>
+              </m:sSubPr>
+              <m:e>
+                <m:r>
+                  <w:rPr>
+                    <w:rFonts w:ascii="Cambria Math" w:hAnsi="Cambria Math" w:cs="Arial"/>
+                  </w:rPr>
+                  <m:t>p</m:t>
+                </m:r>
+              </m:e>
+              <m:sub>
+                <m:r>
+                  <w:rPr>
+                    <w:rFonts w:ascii="Cambria Math" w:hAnsi="Cambria Math" w:cs="Arial"/>
+                  </w:rPr>
+                  <m:t>j</m:t>
+                </m:r>
+              </m:sub>
+            </m:sSub>
+          </m:e>
+        </m:d>
+        <m:r>
+          <w:rPr>
+            <w:rFonts w:ascii="Cambria Math" w:hAnsi="Cambria Math" w:cs="Arial"/>
+            <w:i/>
+          </w:rPr>
+          <m:t> </m:t>
+        </m:r>
+        <m:r>
+          <w:rPr>
+            <w:rFonts w:ascii="Cambria Math" w:hAnsi="Cambria Math" w:cs="Arial"/>
+          </w:rPr>
+          <m:t>∀j∈</m:t>
+        </m:r>
+        <m:nary>
+          <m:naryPr>
+            <m:chr m:val="⋃"/>
+            <m:limLoc m:val="undOvr"/>
+            <m:ctrlPr>
+              <w:rPr>
+                <w:rFonts w:ascii="Cambria Math" w:hAnsi="Cambria Math" w:cs="Arial"/>
+              </w:rPr>
+            </m:ctrlPr>
+          </m:naryPr>
+          <m:sub>
+            <m:r>
+              <w:rPr>
+                <w:rFonts w:ascii="Cambria Math" w:hAnsi="Cambria Math" w:cs="Arial"/>
+              </w:rPr>
+              <m:t>k=1</m:t>
+            </m:r>
+          </m:sub>
+          <m:sup>
+            <m:r>
+              <w:rPr>
+                <w:rFonts w:ascii="Cambria Math" w:hAnsi="Cambria Math" w:cs="Arial"/>
+              </w:rPr>
+              <m:t>K</m:t>
+            </m:r>
+          </m:sup>
+          <m:e>
+            <m:sSub>
+              <m:sSubPr>
+                <m:ctrlPr>
+                  <w:rPr>
+                    <w:rFonts w:ascii="Cambria Math" w:hAnsi="Cambria Math" w:cs="Arial"/>
+                  </w:rPr>
+                </m:ctrlPr>
+              </m:sSubPr>
+              <m:e>
+                <m:r>
+                  <w:rPr>
+                    <w:rFonts w:ascii="Cambria Math" w:hAnsi="Cambria Math" w:cs="Arial"/>
+                  </w:rPr>
+                  <m:t>B</m:t>
+                </m:r>
+              </m:e>
+              <m:sub>
+                <m:r>
+                  <w:rPr>
+                    <w:rFonts w:ascii="Cambria Math" w:hAnsi="Cambria Math" w:cs="Arial"/>
+                  </w:rPr>
+                  <m:t>k</m:t>
+                </m:r>
+              </m:sub>
+            </m:sSub>
+          </m:e>
+        </m:nary>
+      </m:oMath>
+      <w:r>
+        <w:rPr>
+          <w:rFonts w:ascii="Arial" w:hAnsi="Arial" w:cs="Arial"/>
+          <w:color w:val="000000"/>
+        </w:rPr>
+        <w:br/>
+      </w:r>
+      <w:r>
+        <w:rPr>
+          <w:rFonts w:ascii="Arial" w:hAnsi="Arial" w:cs="Arial"/>
+          <w:color w:val="000000"/>
+        </w:rPr>
+        <w:t>Prédiction : Pour chaque bloc cible</w:t>
+      </w:r>
+      <w:r>
+        <w:rPr>
+          <w:rFonts w:ascii="Arial" w:hAnsi="Arial" w:cs="Arial"/>
+        </w:rPr>
+        <w:t> </w:t>
+      </w:r>
+      <m:oMath>
+        <m:r>
+          <w:rPr>
+            <w:rFonts w:ascii="Cambria Math" w:hAnsi="Cambria Math" w:cs="Arial"/>
+          </w:rPr>
+          <m:t>k</m:t>
+        </m:r>
+      </m:oMath>
+      <w:r>
+        <w:rPr>
+          <w:rFonts w:ascii="Arial" w:hAnsi="Arial" w:cs="Arial"/>
+          <w:color w:val="000000"/>
+        </w:rPr>
+        <w:t>, on conditionne le prédicteur avec les positions</w:t>
+      </w:r>
+      <w:r>
+        <w:rPr>
+          <w:rFonts w:ascii="Arial" w:hAnsi="Arial" w:cs="Arial"/>
+        </w:rPr>
+        <w:t> </w:t>
+      </w:r>
+      <m:oMath>
+        <m:r>
+          <w:rPr>
+            <w:rFonts w:ascii="Cambria Math" w:hAnsi="Cambria Math" w:cs="Arial"/>
+          </w:rPr>
+          <m:t>Δ</m:t>
+        </m:r>
+        <m:sSub>
+          <m:sSubPr>
+            <m:ctrlPr>
+              <w:rPr>
+                <w:rFonts w:ascii="Cambria Math" w:hAnsi="Cambria Math" w:cs="Arial"/>
+              </w:rPr>
+            </m:ctrlPr>
+          </m:sSubPr>
+          <m:e>
+            <m:r>
+              <w:rPr>
+                <w:rFonts w:ascii="Cambria Math" w:hAnsi="Cambria Math" w:cs="Arial"/>
+              </w:rPr>
+              <m:t>z</m:t>
+            </m:r>
+          </m:e>
+          <m:sub>
+            <m:r>
+              <w:rPr>
+                <w:rFonts w:ascii="Cambria Math" w:hAnsi="Cambria Math" w:cs="Arial"/>
+              </w:rPr>
+              <m:t>k</m:t>
+            </m:r>
+          </m:sub>
+        </m:sSub>
+      </m:oMath>
+      <w:r>
+        <w:rPr>
+          <w:rFonts w:ascii="Arial" w:hAnsi="Arial" w:cs="Arial"/>
+        </w:rPr>
+        <w:t> </w:t>
+      </w:r>
+      <w:r>
+        <w:rPr>
+          <w:rFonts w:ascii="Arial" w:hAnsi="Arial" w:cs="Arial"/>
+          <w:color w:val="000000"/>
+        </w:rPr>
+        <w:t>des patches du bloc :</w:t>
+      </w:r>
+    </w:p>
+    <w:p>
+      <w:pPr>
+        <w:pStyle w:val="Titre4"/>
+        <w:spacing w:before="0"/>
+        <w:rPr>
+          <w:rFonts w:ascii="Arial" w:eastAsia="Times New Roman" w:hAnsi="Arial" w:cs="Arial"/>
+          <w:color w:val="000000"/>
+          <w:kern w:val="0"/>
+          <w:lang w:eastAsia="fr-FR"/>
+          <w14:ligatures w14:val="none"/>
+        </w:rPr>
+      </w:pPr>
+      <m:oMathPara>
+        <m:oMath>
+          <m:sSub>
+            <m:sSubPr>
+              <m:ctrlPr>
+                <w:rPr>
+                  <w:rFonts w:ascii="Cambria Math" w:eastAsia="Times New Roman" w:hAnsi="Cambria Math" w:cs="Arial"/>
+                  <w:i w:val="0"/>
+                  <w:iCs w:val="0"/>
+                  <w:color w:val="000000"/>
+                  <w:kern w:val="0"/>
+                  <w:lang w:eastAsia="fr-FR"/>
+                  <w14:ligatures w14:val="none"/>
+                </w:rPr>
+              </m:ctrlPr>
+            </m:sSubPr>
+            <m:e>
+              <m:acc>
+                <m:accPr>
+                  <m:chr m:val="ˆ"/>
+                  <m:ctrlPr>
+                    <w:rPr>
+                      <w:rFonts w:ascii="Cambria Math" w:eastAsia="Times New Roman" w:hAnsi="Cambria Math" w:cs="Arial"/>
+                      <w:i w:val="0"/>
+                      <w:iCs w:val="0"/>
+                      <w:color w:val="000000"/>
+                      <w:kern w:val="0"/>
+                      <w:lang w:eastAsia="fr-FR"/>
+                      <w14:ligatures w14:val="none"/>
+                    </w:rPr>
+                  </m:ctrlPr>
+                </m:accPr>
+                <m:e>
+                  <m:r>
+                    <w:rPr>
+                      <w:rFonts w:ascii="Cambria Math" w:eastAsia="Times New Roman" w:hAnsi="Cambria Math" w:cs="Arial"/>
+                      <w:color w:val="000000"/>
+                      <w:kern w:val="0"/>
+                      <w:lang w:eastAsia="fr-FR"/>
+                      <w14:ligatures w14:val="none"/>
+                    </w:rPr>
+                    <m:t>s</m:t>
+                  </m:r>
+                </m:e>
+              </m:acc>
+            </m:e>
+            <m:sub>
+              <m:sSub>
+                <m:sSubPr>
+                  <m:ctrlPr>
+                    <w:rPr>
+                      <w:rFonts w:ascii="Cambria Math" w:eastAsia="Times New Roman" w:hAnsi="Cambria Math" w:cs="Arial"/>
+                      <w:i w:val="0"/>
+                      <w:iCs w:val="0"/>
+                      <w:color w:val="000000"/>
+                      <w:kern w:val="0"/>
+                      <w:lang w:eastAsia="fr-FR"/>
+                      <w14:ligatures w14:val="none"/>
+                    </w:rPr>
+                  </m:ctrlPr>
+                </m:sSubPr>
+                <m:e>
+                  <m:r>
+                    <w:rPr>
+                      <w:rFonts w:ascii="Cambria Math" w:eastAsia="Times New Roman" w:hAnsi="Cambria Math" w:cs="Arial"/>
+                      <w:color w:val="000000"/>
+                      <w:kern w:val="0"/>
+                      <w:lang w:eastAsia="fr-FR"/>
+                      <w14:ligatures w14:val="none"/>
+                    </w:rPr>
+                    <m:t>y</m:t>
+                  </m:r>
+                </m:e>
+                <m:sub>
+                  <m:r>
+                    <w:rPr>
+                      <w:rFonts w:ascii="Cambria Math" w:eastAsia="Times New Roman" w:hAnsi="Cambria Math" w:cs="Arial"/>
+                      <w:color w:val="000000"/>
+                      <w:kern w:val="0"/>
+                      <w:lang w:eastAsia="fr-FR"/>
+                      <w14:ligatures w14:val="none"/>
+                    </w:rPr>
+                    <m:t>k</m:t>
+                  </m:r>
+                </m:sub>
+              </m:sSub>
+            </m:sub>
+          </m:sSub>
+          <m:r>
+            <w:rPr>
+              <w:rFonts w:ascii="Cambria Math" w:eastAsia="Times New Roman" w:hAnsi="Cambria Math" w:cs="Arial"/>
+              <w:color w:val="000000"/>
+              <w:kern w:val="0"/>
+              <w:lang w:eastAsia="fr-FR"/>
+              <w14:ligatures w14:val="none"/>
+            </w:rPr>
+            <m:t>=</m:t>
+          </m:r>
+          <m:sSub>
+            <m:sSubPr>
+              <m:ctrlPr>
+                <w:rPr>
+                  <w:rFonts w:ascii="Cambria Math" w:eastAsia="Times New Roman" w:hAnsi="Cambria Math" w:cs="Arial"/>
+                  <w:i w:val="0"/>
+                  <w:iCs w:val="0"/>
+                  <w:color w:val="000000"/>
+                  <w:kern w:val="0"/>
+                  <w:lang w:eastAsia="fr-FR"/>
+                  <w14:ligatures w14:val="none"/>
+                </w:rPr>
+              </m:ctrlPr>
+            </m:sSubPr>
+            <m:e>
+              <m:r>
+                <w:rPr>
+                  <w:rFonts w:ascii="Cambria Math" w:eastAsia="Times New Roman" w:hAnsi="Cambria Math" w:cs="Arial"/>
+                  <w:color w:val="000000"/>
+                  <w:kern w:val="0"/>
+                  <w:lang w:eastAsia="fr-FR"/>
+                  <w14:ligatures w14:val="none"/>
+                </w:rPr>
+                <m:t>P</m:t>
+              </m:r>
+            </m:e>
+            <m:sub>
+              <m:r>
+                <w:rPr>
+                  <w:rFonts w:ascii="Cambria Math" w:eastAsia="Times New Roman" w:hAnsi="Cambria Math" w:cs="Arial"/>
+                  <w:color w:val="000000"/>
+                  <w:kern w:val="0"/>
+                  <w:lang w:eastAsia="fr-FR"/>
+                  <w14:ligatures w14:val="none"/>
+                </w:rPr>
+                <m:t>ϕ</m:t>
+              </m:r>
+            </m:sub>
+          </m:sSub>
+          <m:d>
+            <m:dPr>
+              <m:ctrlPr>
+                <w:rPr>
+                  <w:rFonts w:ascii="Cambria Math" w:eastAsia="Times New Roman" w:hAnsi="Cambria Math" w:cs="Arial"/>
+                  <w:i w:val="0"/>
+                  <w:iCs w:val="0"/>
+                  <w:color w:val="000000"/>
+                  <w:kern w:val="0"/>
+                  <w:lang w:eastAsia="fr-FR"/>
+                  <w14:ligatures w14:val="none"/>
+                </w:rPr>
+              </m:ctrlPr>
+            </m:dPr>
+            <m:e>
+              <m:sSub>
+                <m:sSubPr>
+                  <m:ctrlPr>
+                    <w:rPr>
+                      <w:rFonts w:ascii="Cambria Math" w:eastAsia="Times New Roman" w:hAnsi="Cambria Math" w:cs="Arial"/>
+                      <w:i w:val="0"/>
+                      <w:iCs w:val="0"/>
+                      <w:color w:val="000000"/>
+                      <w:kern w:val="0"/>
+                      <w:lang w:eastAsia="fr-FR"/>
+                      <w14:ligatures w14:val="none"/>
+                    </w:rPr>
+                  </m:ctrlPr>
+                </m:sSubPr>
+                <m:e>
+                  <m:r>
+                    <w:rPr>
+                      <w:rFonts w:ascii="Cambria Math" w:eastAsia="Times New Roman" w:hAnsi="Cambria Math" w:cs="Arial"/>
+                      <w:color w:val="000000"/>
+                      <w:kern w:val="0"/>
+                      <w:lang w:eastAsia="fr-FR"/>
+                      <w14:ligatures w14:val="none"/>
+                    </w:rPr>
+                    <m:t>s</m:t>
+                  </m:r>
+                </m:e>
+                <m:sub>
+                  <m:r>
+                    <w:rPr>
+                      <w:rFonts w:ascii="Cambria Math" w:eastAsia="Times New Roman" w:hAnsi="Cambria Math" w:cs="Arial"/>
+                      <w:color w:val="000000"/>
+                      <w:kern w:val="0"/>
+                      <w:lang w:eastAsia="fr-FR"/>
+                      <w14:ligatures w14:val="none"/>
+                    </w:rPr>
+                    <m:t>x</m:t>
+                  </m:r>
+                </m:sub>
+              </m:sSub>
+              <m:r>
+                <w:rPr>
+                  <w:rFonts w:ascii="Cambria Math" w:eastAsia="Times New Roman" w:hAnsi="Cambria Math" w:cs="Arial"/>
+                  <w:color w:val="000000"/>
+                  <w:kern w:val="0"/>
+                  <w:lang w:eastAsia="fr-FR"/>
+                  <w14:ligatures w14:val="none"/>
+                </w:rPr>
+                <m:t>,Δ</m:t>
+              </m:r>
+              <m:sSub>
+                <m:sSubPr>
+                  <m:ctrlPr>
+                    <w:rPr>
+                      <w:rFonts w:ascii="Cambria Math" w:eastAsia="Times New Roman" w:hAnsi="Cambria Math" w:cs="Arial"/>
+                      <w:i w:val="0"/>
+                      <w:iCs w:val="0"/>
+                      <w:color w:val="000000"/>
+                      <w:kern w:val="0"/>
+                      <w:lang w:eastAsia="fr-FR"/>
+                      <w14:ligatures w14:val="none"/>
+                    </w:rPr>
+                  </m:ctrlPr>
+                </m:sSubPr>
+                <m:e>
+                  <m:r>
+                    <w:rPr>
+                      <w:rFonts w:ascii="Cambria Math" w:eastAsia="Times New Roman" w:hAnsi="Cambria Math" w:cs="Arial"/>
+                      <w:color w:val="000000"/>
+                      <w:kern w:val="0"/>
+                      <w:lang w:eastAsia="fr-FR"/>
+                      <w14:ligatures w14:val="none"/>
+                    </w:rPr>
+                    <m:t>z</m:t>
+                  </m:r>
+                </m:e>
+                <m:sub>
+                  <m:r>
+                    <w:rPr>
+                      <w:rFonts w:ascii="Cambria Math" w:eastAsia="Times New Roman" w:hAnsi="Cambria Math" w:cs="Arial"/>
+                      <w:color w:val="000000"/>
+                      <w:kern w:val="0"/>
+                      <w:lang w:eastAsia="fr-FR"/>
+                      <w14:ligatures w14:val="none"/>
+                    </w:rPr>
+                    <m:t>k</m:t>
+                  </m:r>
+                </m:sub>
+              </m:sSub>
+            </m:e>
+          </m:d>
+          <m:r>
+            <m:rPr>
+              <m:sty m:val="p"/>
+            </m:rPr>
+            <w:rPr>
+              <w:rFonts w:ascii="Arial" w:eastAsia="Times New Roman" w:hAnsi="Arial" w:cs="Arial"/>
+              <w:color w:val="000000"/>
+              <w:kern w:val="0"/>
+              <w:lang w:eastAsia="fr-FR"/>
+              <w14:ligatures w14:val="none"/>
+            </w:rPr>
+            <w:br/>
+          </m:r>
+        </m:oMath>
+      </m:oMathPara>
+    </w:p>
+    <w:p>
+      <w:pPr>
+        <w:pStyle w:val="Titre3"/>
+        <w:rPr>
+          <w:rFonts w:eastAsia="Times New Roman"/>
+          <w:lang w:eastAsia="fr-FR"/>
+        </w:rPr>
+      </w:pPr>
+      <w:r>
+        <w:rPr>
+          <w:rFonts w:eastAsia="Times New Roman"/>
+          <w:lang w:eastAsia="fr-FR"/>
+        </w:rPr>
+        <w:t>L'Innovation Opérationnelle : Le Masquage Spatial Multi-Blocs</w:t>
+      </w:r>
+    </w:p>
+    <w:p>
+      <w:pPr>
         <w:spacing w:after="100" w:afterAutospacing="1" w:line="240" w:lineRule="auto"/>
         <w:rPr>
           <w:rFonts w:ascii="Arial" w:eastAsia="Times New Roman" w:hAnsi="Arial" w:cs="Times New Roman"/>
@@ -5830,6 +6901,7 @@
           <w:lang w:eastAsia="fr-FR"/>
           <w14:ligatures w14:val="none"/>
         </w:rPr>
+        <w:lastRenderedPageBreak/>
         <w:t xml:space="preserve">Contrairement aux méthodes génératives antérieures qui masquent des patches de manière totalement aléatoire et éparse, ce qui incite le modèle à effectuer une simple interpolation locale de pixels voisins, I-JEPA génère ses cibles et son contexte par de très grands blocs continus. </w:t>
       </w:r>
     </w:p>
@@ -5890,7 +6962,6 @@
           <w:rFonts w:eastAsia="Times New Roman"/>
           <w:lang w:eastAsia="fr-FR"/>
         </w:rPr>
-        <w:lastRenderedPageBreak/>
         <w:t>Formulation Mathématique et Fonction d'Objectif</w:t>
       </w:r>
     </w:p>
@@ -8094,7 +9165,18 @@
           <w:lang w:eastAsia="fr-FR"/>
           <w14:ligatures w14:val="none"/>
         </w:rPr>
-        <w:t xml:space="preserve"> avec une dimension d'</w:t>
+        <w:t xml:space="preserve"> avec une </w:t>
+      </w:r>
+      <w:r>
+        <w:rPr>
+          <w:rFonts w:ascii="Arial" w:eastAsia="Times New Roman" w:hAnsi="Arial" w:cs="Times New Roman"/>
+          <w:color w:val="000000"/>
+          <w:kern w:val="0"/>
+          <w:lang w:eastAsia="fr-FR"/>
+          <w14:ligatures w14:val="none"/>
+        </w:rPr>
+        <w:lastRenderedPageBreak/>
+        <w:t>dimension d'</w:t>
       </w:r>
       <w:proofErr w:type="spellStart"/>
       <w:r>
@@ -8334,18 +9416,7 @@
           <w:lang w:eastAsia="fr-FR"/>
           <w14:ligatures w14:val="none"/>
         </w:rPr>
-        <w:t xml:space="preserve">on utilise une technique appelée le "déclin des poids" ou Weight Decay (historiquement lié à la régularisation L2). Cette technique consiste à pénaliser les poids qui deviennent trop grands, en les forçant à rétrécir légèrement vers zéro à chaque itération. Dans </w:t>
-      </w:r>
-      <w:r>
-        <w:rPr>
-          <w:rFonts w:ascii="Arial" w:eastAsia="Times New Roman" w:hAnsi="Arial" w:cs="Times New Roman"/>
-          <w:color w:val="000000"/>
-          <w:kern w:val="0"/>
-          <w:lang w:eastAsia="fr-FR"/>
-          <w14:ligatures w14:val="none"/>
-        </w:rPr>
-        <w:lastRenderedPageBreak/>
-        <w:t xml:space="preserve">l'algorithme Adam originel, cette pénalité était mélangée de manière erronée avec l'adaptation dynamique des gradients, ce qui annulait en grande partie son effet </w:t>
+        <w:t xml:space="preserve">on utilise une technique appelée le "déclin des poids" ou Weight Decay (historiquement lié à la régularisation L2). Cette technique consiste à pénaliser les poids qui deviennent trop grands, en les forçant à rétrécir légèrement vers zéro à chaque itération. Dans l'algorithme Adam originel, cette pénalité était mélangée de manière erronée avec l'adaptation dynamique des gradients, ce qui annulait en grande partie son effet </w:t>
       </w:r>
       <w:proofErr w:type="spellStart"/>
       <w:r>
@@ -8641,7 +9712,18 @@
           <w:lang w:eastAsia="fr-FR"/>
           <w14:ligatures w14:val="none"/>
         </w:rPr>
-        <w:t>. Toutefois, si le modèle continue à faire de grands bonds vers la fin de l'entraînement, il va sans cesse rebondir autour de la solution optimale sans jamais pouvoir s'y arrêter avec précision. Il est donc indispensable de réduire la taille des pas d'apprentissage au fil du temps.</w:t>
+        <w:t xml:space="preserve">. Toutefois, si le modèle continue à faire de grands bonds vers la fin de l'entraînement, il va sans cesse rebondir autour </w:t>
+      </w:r>
+      <w:r>
+        <w:rPr>
+          <w:rFonts w:ascii="Arial" w:eastAsia="Times New Roman" w:hAnsi="Arial" w:cs="Times New Roman"/>
+          <w:color w:val="000000"/>
+          <w:kern w:val="0"/>
+          <w:lang w:eastAsia="fr-FR"/>
+          <w14:ligatures w14:val="none"/>
+        </w:rPr>
+        <w:lastRenderedPageBreak/>
+        <w:t>de la solution optimale sans jamais pouvoir s'y arrêter avec précision. Il est donc indispensable de réduire la taille des pas d'apprentissage au fil du temps.</w:t>
       </w:r>
     </w:p>
     <w:p>
@@ -8815,18 +9897,7 @@
           <w:lang w:eastAsia="fr-FR"/>
           <w14:ligatures w14:val="none"/>
         </w:rPr>
-        <w:t xml:space="preserve">L'efficacité de calcul d'I-JEPA est tout simplement remarquable par rapport à l'état de l'art. Puisque l'encodeur ne traite algorithmiquement que les patches visibles et que le prédicteur opère exclusivement dans un espace latent bien plus compact que celui de la haute résolution des pixels, l'entraînement est extrêmement rapide. L'article </w:t>
-      </w:r>
-      <w:r>
-        <w:rPr>
-          <w:rFonts w:ascii="Arial" w:eastAsia="Times New Roman" w:hAnsi="Arial" w:cs="Times New Roman"/>
-          <w:color w:val="000000"/>
-          <w:kern w:val="0"/>
-          <w:lang w:eastAsia="fr-FR"/>
-          <w14:ligatures w14:val="none"/>
-        </w:rPr>
-        <w:lastRenderedPageBreak/>
-        <w:t xml:space="preserve">justifie scientifiquement cette supériorité en soulignant que l'entraînement d'un modèle massif </w:t>
+        <w:t xml:space="preserve">L'efficacité de calcul d'I-JEPA est tout simplement remarquable par rapport à l'état de l'art. Puisque l'encodeur ne traite algorithmiquement que les patches visibles et que le prédicteur opère exclusivement dans un espace latent bien plus compact que celui de la haute résolution des pixels, l'entraînement est extrêmement rapide. L'article justifie scientifiquement cette supériorité en soulignant que l'entraînement d'un modèle massif </w:t>
       </w:r>
       <w:proofErr w:type="spellStart"/>
       <w:r>
@@ -9059,6 +10130,7 @@
           <w:lang w:eastAsia="fr-FR"/>
           <w14:ligatures w14:val="none"/>
         </w:rPr>
+        <w:lastRenderedPageBreak/>
         <w:t>(1</w:t>
       </w:r>
       <w:r>
@@ -9251,18 +10323,7 @@
           <w:lang w:eastAsia="fr-FR"/>
           <w14:ligatures w14:val="none"/>
         </w:rPr>
-        <w:t xml:space="preserve">Les auteurs concluent enfin sur l'excellente capacité de la méthode à passer à l'échelle : plus on augmente la capacité paramétrique du modèle de base, plus l'écart </w:t>
-      </w:r>
-      <w:r>
-        <w:rPr>
-          <w:rFonts w:ascii="Arial" w:eastAsia="Times New Roman" w:hAnsi="Arial" w:cs="Times New Roman"/>
-          <w:color w:val="000000"/>
-          <w:kern w:val="0"/>
-          <w:lang w:eastAsia="fr-FR"/>
-          <w14:ligatures w14:val="none"/>
-        </w:rPr>
-        <w:lastRenderedPageBreak/>
-        <w:t xml:space="preserve">de performance en faveur d'I-JEPA s'élargit par rapport aux approches concurrentes. Les scientifiques de FAIR aboutissent ainsi à la conclusion que l'architecture </w:t>
+        <w:t xml:space="preserve">Les auteurs concluent enfin sur l'excellente capacité de la méthode à passer à l'échelle : plus on augmente la capacité paramétrique du modèle de base, plus l'écart de performance en faveur d'I-JEPA s'élargit par rapport aux approches concurrentes. Les scientifiques de FAIR aboutissent ainsi à la conclusion que l'architecture </w:t>
       </w:r>
       <w:r>
         <w:rPr>
@@ -9421,6 +10482,941 @@
     </w:lvl>
   </w:abstractNum>
   <w:abstractNum w:abstractNumId="1" w15:restartNumberingAfterBreak="0">
+    <w:nsid w:val="0E465612"/>
+    <w:multiLevelType w:val="multilevel"/>
+    <w:tmpl w:val="65CCC670"/>
+    <w:lvl w:ilvl="0">
+      <w:start w:val="1"/>
+      <w:numFmt w:val="bullet"/>
+      <w:lvlText w:val=""/>
+      <w:lvlJc w:val="left"/>
+      <w:pPr>
+        <w:tabs>
+          <w:tab w:val="num" w:pos="720"/>
+        </w:tabs>
+        <w:ind w:left="720" w:hanging="360"/>
+      </w:pPr>
+      <w:rPr>
+        <w:rFonts w:ascii="Symbol" w:hAnsi="Symbol" w:hint="default"/>
+        <w:sz w:val="20"/>
+      </w:rPr>
+    </w:lvl>
+    <w:lvl w:ilvl="1">
+      <w:start w:val="1"/>
+      <w:numFmt w:val="bullet"/>
+      <w:lvlText w:val="o"/>
+      <w:lvlJc w:val="left"/>
+      <w:pPr>
+        <w:tabs>
+          <w:tab w:val="num" w:pos="1440"/>
+        </w:tabs>
+        <w:ind w:left="1440" w:hanging="360"/>
+      </w:pPr>
+      <w:rPr>
+        <w:rFonts w:ascii="Courier New" w:hAnsi="Courier New" w:hint="default"/>
+        <w:sz w:val="20"/>
+      </w:rPr>
+    </w:lvl>
+    <w:lvl w:ilvl="2" w:tentative="1">
+      <w:start w:val="1"/>
+      <w:numFmt w:val="bullet"/>
+      <w:lvlText w:val=""/>
+      <w:lvlJc w:val="left"/>
+      <w:pPr>
+        <w:tabs>
+          <w:tab w:val="num" w:pos="2160"/>
+        </w:tabs>
+        <w:ind w:left="2160" w:hanging="360"/>
+      </w:pPr>
+      <w:rPr>
+        <w:rFonts w:ascii="Wingdings" w:hAnsi="Wingdings" w:hint="default"/>
+        <w:sz w:val="20"/>
+      </w:rPr>
+    </w:lvl>
+    <w:lvl w:ilvl="3" w:tentative="1">
+      <w:start w:val="1"/>
+      <w:numFmt w:val="bullet"/>
+      <w:lvlText w:val=""/>
+      <w:lvlJc w:val="left"/>
+      <w:pPr>
+        <w:tabs>
+          <w:tab w:val="num" w:pos="2880"/>
+        </w:tabs>
+        <w:ind w:left="2880" w:hanging="360"/>
+      </w:pPr>
+      <w:rPr>
+        <w:rFonts w:ascii="Wingdings" w:hAnsi="Wingdings" w:hint="default"/>
+        <w:sz w:val="20"/>
+      </w:rPr>
+    </w:lvl>
+    <w:lvl w:ilvl="4" w:tentative="1">
+      <w:start w:val="1"/>
+      <w:numFmt w:val="bullet"/>
+      <w:lvlText w:val=""/>
+      <w:lvlJc w:val="left"/>
+      <w:pPr>
+        <w:tabs>
+          <w:tab w:val="num" w:pos="3600"/>
+        </w:tabs>
+        <w:ind w:left="3600" w:hanging="360"/>
+      </w:pPr>
+      <w:rPr>
+        <w:rFonts w:ascii="Wingdings" w:hAnsi="Wingdings" w:hint="default"/>
+        <w:sz w:val="20"/>
+      </w:rPr>
+    </w:lvl>
+    <w:lvl w:ilvl="5" w:tentative="1">
+      <w:start w:val="1"/>
+      <w:numFmt w:val="bullet"/>
+      <w:lvlText w:val=""/>
+      <w:lvlJc w:val="left"/>
+      <w:pPr>
+        <w:tabs>
+          <w:tab w:val="num" w:pos="4320"/>
+        </w:tabs>
+        <w:ind w:left="4320" w:hanging="360"/>
+      </w:pPr>
+      <w:rPr>
+        <w:rFonts w:ascii="Wingdings" w:hAnsi="Wingdings" w:hint="default"/>
+        <w:sz w:val="20"/>
+      </w:rPr>
+    </w:lvl>
+    <w:lvl w:ilvl="6" w:tentative="1">
+      <w:start w:val="1"/>
+      <w:numFmt w:val="bullet"/>
+      <w:lvlText w:val=""/>
+      <w:lvlJc w:val="left"/>
+      <w:pPr>
+        <w:tabs>
+          <w:tab w:val="num" w:pos="5040"/>
+        </w:tabs>
+        <w:ind w:left="5040" w:hanging="360"/>
+      </w:pPr>
+      <w:rPr>
+        <w:rFonts w:ascii="Wingdings" w:hAnsi="Wingdings" w:hint="default"/>
+        <w:sz w:val="20"/>
+      </w:rPr>
+    </w:lvl>
+    <w:lvl w:ilvl="7" w:tentative="1">
+      <w:start w:val="1"/>
+      <w:numFmt w:val="bullet"/>
+      <w:lvlText w:val=""/>
+      <w:lvlJc w:val="left"/>
+      <w:pPr>
+        <w:tabs>
+          <w:tab w:val="num" w:pos="5760"/>
+        </w:tabs>
+        <w:ind w:left="5760" w:hanging="360"/>
+      </w:pPr>
+      <w:rPr>
+        <w:rFonts w:ascii="Wingdings" w:hAnsi="Wingdings" w:hint="default"/>
+        <w:sz w:val="20"/>
+      </w:rPr>
+    </w:lvl>
+    <w:lvl w:ilvl="8" w:tentative="1">
+      <w:start w:val="1"/>
+      <w:numFmt w:val="bullet"/>
+      <w:lvlText w:val=""/>
+      <w:lvlJc w:val="left"/>
+      <w:pPr>
+        <w:tabs>
+          <w:tab w:val="num" w:pos="6480"/>
+        </w:tabs>
+        <w:ind w:left="6480" w:hanging="360"/>
+      </w:pPr>
+      <w:rPr>
+        <w:rFonts w:ascii="Wingdings" w:hAnsi="Wingdings" w:hint="default"/>
+        <w:sz w:val="20"/>
+      </w:rPr>
+    </w:lvl>
+  </w:abstractNum>
+  <w:abstractNum w:abstractNumId="2" w15:restartNumberingAfterBreak="0">
+    <w:nsid w:val="288A5E5C"/>
+    <w:multiLevelType w:val="multilevel"/>
+    <w:tmpl w:val="80E2CFD8"/>
+    <w:lvl w:ilvl="0">
+      <w:start w:val="1"/>
+      <w:numFmt w:val="bullet"/>
+      <w:lvlText w:val=""/>
+      <w:lvlJc w:val="left"/>
+      <w:pPr>
+        <w:tabs>
+          <w:tab w:val="num" w:pos="720"/>
+        </w:tabs>
+        <w:ind w:left="720" w:hanging="360"/>
+      </w:pPr>
+      <w:rPr>
+        <w:rFonts w:ascii="Symbol" w:hAnsi="Symbol" w:hint="default"/>
+        <w:sz w:val="20"/>
+      </w:rPr>
+    </w:lvl>
+    <w:lvl w:ilvl="1" w:tentative="1">
+      <w:start w:val="1"/>
+      <w:numFmt w:val="bullet"/>
+      <w:lvlText w:val="o"/>
+      <w:lvlJc w:val="left"/>
+      <w:pPr>
+        <w:tabs>
+          <w:tab w:val="num" w:pos="1440"/>
+        </w:tabs>
+        <w:ind w:left="1440" w:hanging="360"/>
+      </w:pPr>
+      <w:rPr>
+        <w:rFonts w:ascii="Courier New" w:hAnsi="Courier New" w:hint="default"/>
+        <w:sz w:val="20"/>
+      </w:rPr>
+    </w:lvl>
+    <w:lvl w:ilvl="2" w:tentative="1">
+      <w:start w:val="1"/>
+      <w:numFmt w:val="bullet"/>
+      <w:lvlText w:val=""/>
+      <w:lvlJc w:val="left"/>
+      <w:pPr>
+        <w:tabs>
+          <w:tab w:val="num" w:pos="2160"/>
+        </w:tabs>
+        <w:ind w:left="2160" w:hanging="360"/>
+      </w:pPr>
+      <w:rPr>
+        <w:rFonts w:ascii="Wingdings" w:hAnsi="Wingdings" w:hint="default"/>
+        <w:sz w:val="20"/>
+      </w:rPr>
+    </w:lvl>
+    <w:lvl w:ilvl="3" w:tentative="1">
+      <w:start w:val="1"/>
+      <w:numFmt w:val="bullet"/>
+      <w:lvlText w:val=""/>
+      <w:lvlJc w:val="left"/>
+      <w:pPr>
+        <w:tabs>
+          <w:tab w:val="num" w:pos="2880"/>
+        </w:tabs>
+        <w:ind w:left="2880" w:hanging="360"/>
+      </w:pPr>
+      <w:rPr>
+        <w:rFonts w:ascii="Wingdings" w:hAnsi="Wingdings" w:hint="default"/>
+        <w:sz w:val="20"/>
+      </w:rPr>
+    </w:lvl>
+    <w:lvl w:ilvl="4" w:tentative="1">
+      <w:start w:val="1"/>
+      <w:numFmt w:val="bullet"/>
+      <w:lvlText w:val=""/>
+      <w:lvlJc w:val="left"/>
+      <w:pPr>
+        <w:tabs>
+          <w:tab w:val="num" w:pos="3600"/>
+        </w:tabs>
+        <w:ind w:left="3600" w:hanging="360"/>
+      </w:pPr>
+      <w:rPr>
+        <w:rFonts w:ascii="Wingdings" w:hAnsi="Wingdings" w:hint="default"/>
+        <w:sz w:val="20"/>
+      </w:rPr>
+    </w:lvl>
+    <w:lvl w:ilvl="5" w:tentative="1">
+      <w:start w:val="1"/>
+      <w:numFmt w:val="bullet"/>
+      <w:lvlText w:val=""/>
+      <w:lvlJc w:val="left"/>
+      <w:pPr>
+        <w:tabs>
+          <w:tab w:val="num" w:pos="4320"/>
+        </w:tabs>
+        <w:ind w:left="4320" w:hanging="360"/>
+      </w:pPr>
+      <w:rPr>
+        <w:rFonts w:ascii="Wingdings" w:hAnsi="Wingdings" w:hint="default"/>
+        <w:sz w:val="20"/>
+      </w:rPr>
+    </w:lvl>
+    <w:lvl w:ilvl="6" w:tentative="1">
+      <w:start w:val="1"/>
+      <w:numFmt w:val="bullet"/>
+      <w:lvlText w:val=""/>
+      <w:lvlJc w:val="left"/>
+      <w:pPr>
+        <w:tabs>
+          <w:tab w:val="num" w:pos="5040"/>
+        </w:tabs>
+        <w:ind w:left="5040" w:hanging="360"/>
+      </w:pPr>
+      <w:rPr>
+        <w:rFonts w:ascii="Wingdings" w:hAnsi="Wingdings" w:hint="default"/>
+        <w:sz w:val="20"/>
+      </w:rPr>
+    </w:lvl>
+    <w:lvl w:ilvl="7" w:tentative="1">
+      <w:start w:val="1"/>
+      <w:numFmt w:val="bullet"/>
+      <w:lvlText w:val=""/>
+      <w:lvlJc w:val="left"/>
+      <w:pPr>
+        <w:tabs>
+          <w:tab w:val="num" w:pos="5760"/>
+        </w:tabs>
+        <w:ind w:left="5760" w:hanging="360"/>
+      </w:pPr>
+      <w:rPr>
+        <w:rFonts w:ascii="Wingdings" w:hAnsi="Wingdings" w:hint="default"/>
+        <w:sz w:val="20"/>
+      </w:rPr>
+    </w:lvl>
+    <w:lvl w:ilvl="8" w:tentative="1">
+      <w:start w:val="1"/>
+      <w:numFmt w:val="bullet"/>
+      <w:lvlText w:val=""/>
+      <w:lvlJc w:val="left"/>
+      <w:pPr>
+        <w:tabs>
+          <w:tab w:val="num" w:pos="6480"/>
+        </w:tabs>
+        <w:ind w:left="6480" w:hanging="360"/>
+      </w:pPr>
+      <w:rPr>
+        <w:rFonts w:ascii="Wingdings" w:hAnsi="Wingdings" w:hint="default"/>
+        <w:sz w:val="20"/>
+      </w:rPr>
+    </w:lvl>
+  </w:abstractNum>
+  <w:abstractNum w:abstractNumId="3" w15:restartNumberingAfterBreak="0">
+    <w:nsid w:val="2DB666BD"/>
+    <w:multiLevelType w:val="multilevel"/>
+    <w:tmpl w:val="48240B54"/>
+    <w:lvl w:ilvl="0">
+      <w:start w:val="1"/>
+      <w:numFmt w:val="bullet"/>
+      <w:lvlText w:val=""/>
+      <w:lvlJc w:val="left"/>
+      <w:pPr>
+        <w:tabs>
+          <w:tab w:val="num" w:pos="720"/>
+        </w:tabs>
+        <w:ind w:left="720" w:hanging="360"/>
+      </w:pPr>
+      <w:rPr>
+        <w:rFonts w:ascii="Symbol" w:hAnsi="Symbol" w:hint="default"/>
+        <w:sz w:val="20"/>
+      </w:rPr>
+    </w:lvl>
+    <w:lvl w:ilvl="1" w:tentative="1">
+      <w:start w:val="1"/>
+      <w:numFmt w:val="bullet"/>
+      <w:lvlText w:val="o"/>
+      <w:lvlJc w:val="left"/>
+      <w:pPr>
+        <w:tabs>
+          <w:tab w:val="num" w:pos="1440"/>
+        </w:tabs>
+        <w:ind w:left="1440" w:hanging="360"/>
+      </w:pPr>
+      <w:rPr>
+        <w:rFonts w:ascii="Courier New" w:hAnsi="Courier New" w:hint="default"/>
+        <w:sz w:val="20"/>
+      </w:rPr>
+    </w:lvl>
+    <w:lvl w:ilvl="2" w:tentative="1">
+      <w:start w:val="1"/>
+      <w:numFmt w:val="bullet"/>
+      <w:lvlText w:val=""/>
+      <w:lvlJc w:val="left"/>
+      <w:pPr>
+        <w:tabs>
+          <w:tab w:val="num" w:pos="2160"/>
+        </w:tabs>
+        <w:ind w:left="2160" w:hanging="360"/>
+      </w:pPr>
+      <w:rPr>
+        <w:rFonts w:ascii="Wingdings" w:hAnsi="Wingdings" w:hint="default"/>
+        <w:sz w:val="20"/>
+      </w:rPr>
+    </w:lvl>
+    <w:lvl w:ilvl="3" w:tentative="1">
+      <w:start w:val="1"/>
+      <w:numFmt w:val="bullet"/>
+      <w:lvlText w:val=""/>
+      <w:lvlJc w:val="left"/>
+      <w:pPr>
+        <w:tabs>
+          <w:tab w:val="num" w:pos="2880"/>
+        </w:tabs>
+        <w:ind w:left="2880" w:hanging="360"/>
+      </w:pPr>
+      <w:rPr>
+        <w:rFonts w:ascii="Wingdings" w:hAnsi="Wingdings" w:hint="default"/>
+        <w:sz w:val="20"/>
+      </w:rPr>
+    </w:lvl>
+    <w:lvl w:ilvl="4" w:tentative="1">
+      <w:start w:val="1"/>
+      <w:numFmt w:val="bullet"/>
+      <w:lvlText w:val=""/>
+      <w:lvlJc w:val="left"/>
+      <w:pPr>
+        <w:tabs>
+          <w:tab w:val="num" w:pos="3600"/>
+        </w:tabs>
+        <w:ind w:left="3600" w:hanging="360"/>
+      </w:pPr>
+      <w:rPr>
+        <w:rFonts w:ascii="Wingdings" w:hAnsi="Wingdings" w:hint="default"/>
+        <w:sz w:val="20"/>
+      </w:rPr>
+    </w:lvl>
+    <w:lvl w:ilvl="5" w:tentative="1">
+      <w:start w:val="1"/>
+      <w:numFmt w:val="bullet"/>
+      <w:lvlText w:val=""/>
+      <w:lvlJc w:val="left"/>
+      <w:pPr>
+        <w:tabs>
+          <w:tab w:val="num" w:pos="4320"/>
+        </w:tabs>
+        <w:ind w:left="4320" w:hanging="360"/>
+      </w:pPr>
+      <w:rPr>
+        <w:rFonts w:ascii="Wingdings" w:hAnsi="Wingdings" w:hint="default"/>
+        <w:sz w:val="20"/>
+      </w:rPr>
+    </w:lvl>
+    <w:lvl w:ilvl="6" w:tentative="1">
+      <w:start w:val="1"/>
+      <w:numFmt w:val="bullet"/>
+      <w:lvlText w:val=""/>
+      <w:lvlJc w:val="left"/>
+      <w:pPr>
+        <w:tabs>
+          <w:tab w:val="num" w:pos="5040"/>
+        </w:tabs>
+        <w:ind w:left="5040" w:hanging="360"/>
+      </w:pPr>
+      <w:rPr>
+        <w:rFonts w:ascii="Wingdings" w:hAnsi="Wingdings" w:hint="default"/>
+        <w:sz w:val="20"/>
+      </w:rPr>
+    </w:lvl>
+    <w:lvl w:ilvl="7" w:tentative="1">
+      <w:start w:val="1"/>
+      <w:numFmt w:val="bullet"/>
+      <w:lvlText w:val=""/>
+      <w:lvlJc w:val="left"/>
+      <w:pPr>
+        <w:tabs>
+          <w:tab w:val="num" w:pos="5760"/>
+        </w:tabs>
+        <w:ind w:left="5760" w:hanging="360"/>
+      </w:pPr>
+      <w:rPr>
+        <w:rFonts w:ascii="Wingdings" w:hAnsi="Wingdings" w:hint="default"/>
+        <w:sz w:val="20"/>
+      </w:rPr>
+    </w:lvl>
+    <w:lvl w:ilvl="8" w:tentative="1">
+      <w:start w:val="1"/>
+      <w:numFmt w:val="bullet"/>
+      <w:lvlText w:val=""/>
+      <w:lvlJc w:val="left"/>
+      <w:pPr>
+        <w:tabs>
+          <w:tab w:val="num" w:pos="6480"/>
+        </w:tabs>
+        <w:ind w:left="6480" w:hanging="360"/>
+      </w:pPr>
+      <w:rPr>
+        <w:rFonts w:ascii="Wingdings" w:hAnsi="Wingdings" w:hint="default"/>
+        <w:sz w:val="20"/>
+      </w:rPr>
+    </w:lvl>
+  </w:abstractNum>
+  <w:abstractNum w:abstractNumId="4" w15:restartNumberingAfterBreak="0">
+    <w:nsid w:val="4B5F2F6E"/>
+    <w:multiLevelType w:val="multilevel"/>
+    <w:tmpl w:val="A27AA7F4"/>
+    <w:lvl w:ilvl="0">
+      <w:start w:val="1"/>
+      <w:numFmt w:val="decimal"/>
+      <w:lvlText w:val="%1."/>
+      <w:lvlJc w:val="left"/>
+      <w:pPr>
+        <w:tabs>
+          <w:tab w:val="num" w:pos="720"/>
+        </w:tabs>
+        <w:ind w:left="720" w:hanging="360"/>
+      </w:pPr>
+    </w:lvl>
+    <w:lvl w:ilvl="1" w:tentative="1">
+      <w:start w:val="1"/>
+      <w:numFmt w:val="decimal"/>
+      <w:lvlText w:val="%2."/>
+      <w:lvlJc w:val="left"/>
+      <w:pPr>
+        <w:tabs>
+          <w:tab w:val="num" w:pos="1440"/>
+        </w:tabs>
+        <w:ind w:left="1440" w:hanging="360"/>
+      </w:pPr>
+    </w:lvl>
+    <w:lvl w:ilvl="2" w:tentative="1">
+      <w:start w:val="1"/>
+      <w:numFmt w:val="decimal"/>
+      <w:lvlText w:val="%3."/>
+      <w:lvlJc w:val="left"/>
+      <w:pPr>
+        <w:tabs>
+          <w:tab w:val="num" w:pos="2160"/>
+        </w:tabs>
+        <w:ind w:left="2160" w:hanging="360"/>
+      </w:pPr>
+    </w:lvl>
+    <w:lvl w:ilvl="3" w:tentative="1">
+      <w:start w:val="1"/>
+      <w:numFmt w:val="decimal"/>
+      <w:lvlText w:val="%4."/>
+      <w:lvlJc w:val="left"/>
+      <w:pPr>
+        <w:tabs>
+          <w:tab w:val="num" w:pos="2880"/>
+        </w:tabs>
+        <w:ind w:left="2880" w:hanging="360"/>
+      </w:pPr>
+    </w:lvl>
+    <w:lvl w:ilvl="4" w:tentative="1">
+      <w:start w:val="1"/>
+      <w:numFmt w:val="decimal"/>
+      <w:lvlText w:val="%5."/>
+      <w:lvlJc w:val="left"/>
+      <w:pPr>
+        <w:tabs>
+          <w:tab w:val="num" w:pos="3600"/>
+        </w:tabs>
+        <w:ind w:left="3600" w:hanging="360"/>
+      </w:pPr>
+    </w:lvl>
+    <w:lvl w:ilvl="5" w:tentative="1">
+      <w:start w:val="1"/>
+      <w:numFmt w:val="decimal"/>
+      <w:lvlText w:val="%6."/>
+      <w:lvlJc w:val="left"/>
+      <w:pPr>
+        <w:tabs>
+          <w:tab w:val="num" w:pos="4320"/>
+        </w:tabs>
+        <w:ind w:left="4320" w:hanging="360"/>
+      </w:pPr>
+    </w:lvl>
+    <w:lvl w:ilvl="6" w:tentative="1">
+      <w:start w:val="1"/>
+      <w:numFmt w:val="decimal"/>
+      <w:lvlText w:val="%7."/>
+      <w:lvlJc w:val="left"/>
+      <w:pPr>
+        <w:tabs>
+          <w:tab w:val="num" w:pos="5040"/>
+        </w:tabs>
+        <w:ind w:left="5040" w:hanging="360"/>
+      </w:pPr>
+    </w:lvl>
+    <w:lvl w:ilvl="7" w:tentative="1">
+      <w:start w:val="1"/>
+      <w:numFmt w:val="decimal"/>
+      <w:lvlText w:val="%8."/>
+      <w:lvlJc w:val="left"/>
+      <w:pPr>
+        <w:tabs>
+          <w:tab w:val="num" w:pos="5760"/>
+        </w:tabs>
+        <w:ind w:left="5760" w:hanging="360"/>
+      </w:pPr>
+    </w:lvl>
+    <w:lvl w:ilvl="8" w:tentative="1">
+      <w:start w:val="1"/>
+      <w:numFmt w:val="decimal"/>
+      <w:lvlText w:val="%9."/>
+      <w:lvlJc w:val="left"/>
+      <w:pPr>
+        <w:tabs>
+          <w:tab w:val="num" w:pos="6480"/>
+        </w:tabs>
+        <w:ind w:left="6480" w:hanging="360"/>
+      </w:pPr>
+    </w:lvl>
+  </w:abstractNum>
+  <w:abstractNum w:abstractNumId="5" w15:restartNumberingAfterBreak="0">
+    <w:nsid w:val="4E4D17AF"/>
+    <w:multiLevelType w:val="multilevel"/>
+    <w:tmpl w:val="A7887AD4"/>
+    <w:lvl w:ilvl="0">
+      <w:start w:val="1"/>
+      <w:numFmt w:val="decimal"/>
+      <w:lvlText w:val="%1."/>
+      <w:lvlJc w:val="left"/>
+      <w:pPr>
+        <w:tabs>
+          <w:tab w:val="num" w:pos="720"/>
+        </w:tabs>
+        <w:ind w:left="720" w:hanging="360"/>
+      </w:pPr>
+    </w:lvl>
+    <w:lvl w:ilvl="1" w:tentative="1">
+      <w:start w:val="1"/>
+      <w:numFmt w:val="decimal"/>
+      <w:lvlText w:val="%2."/>
+      <w:lvlJc w:val="left"/>
+      <w:pPr>
+        <w:tabs>
+          <w:tab w:val="num" w:pos="1440"/>
+        </w:tabs>
+        <w:ind w:left="1440" w:hanging="360"/>
+      </w:pPr>
+    </w:lvl>
+    <w:lvl w:ilvl="2" w:tentative="1">
+      <w:start w:val="1"/>
+      <w:numFmt w:val="decimal"/>
+      <w:lvlText w:val="%3."/>
+      <w:lvlJc w:val="left"/>
+      <w:pPr>
+        <w:tabs>
+          <w:tab w:val="num" w:pos="2160"/>
+        </w:tabs>
+        <w:ind w:left="2160" w:hanging="360"/>
+      </w:pPr>
+    </w:lvl>
+    <w:lvl w:ilvl="3" w:tentative="1">
+      <w:start w:val="1"/>
+      <w:numFmt w:val="decimal"/>
+      <w:lvlText w:val="%4."/>
+      <w:lvlJc w:val="left"/>
+      <w:pPr>
+        <w:tabs>
+          <w:tab w:val="num" w:pos="2880"/>
+        </w:tabs>
+        <w:ind w:left="2880" w:hanging="360"/>
+      </w:pPr>
+    </w:lvl>
+    <w:lvl w:ilvl="4" w:tentative="1">
+      <w:start w:val="1"/>
+      <w:numFmt w:val="decimal"/>
+      <w:lvlText w:val="%5."/>
+      <w:lvlJc w:val="left"/>
+      <w:pPr>
+        <w:tabs>
+          <w:tab w:val="num" w:pos="3600"/>
+        </w:tabs>
+        <w:ind w:left="3600" w:hanging="360"/>
+      </w:pPr>
+    </w:lvl>
+    <w:lvl w:ilvl="5" w:tentative="1">
+      <w:start w:val="1"/>
+      <w:numFmt w:val="decimal"/>
+      <w:lvlText w:val="%6."/>
+      <w:lvlJc w:val="left"/>
+      <w:pPr>
+        <w:tabs>
+          <w:tab w:val="num" w:pos="4320"/>
+        </w:tabs>
+        <w:ind w:left="4320" w:hanging="360"/>
+      </w:pPr>
+    </w:lvl>
+    <w:lvl w:ilvl="6" w:tentative="1">
+      <w:start w:val="1"/>
+      <w:numFmt w:val="decimal"/>
+      <w:lvlText w:val="%7."/>
+      <w:lvlJc w:val="left"/>
+      <w:pPr>
+        <w:tabs>
+          <w:tab w:val="num" w:pos="5040"/>
+        </w:tabs>
+        <w:ind w:left="5040" w:hanging="360"/>
+      </w:pPr>
+    </w:lvl>
+    <w:lvl w:ilvl="7" w:tentative="1">
+      <w:start w:val="1"/>
+      <w:numFmt w:val="decimal"/>
+      <w:lvlText w:val="%8."/>
+      <w:lvlJc w:val="left"/>
+      <w:pPr>
+        <w:tabs>
+          <w:tab w:val="num" w:pos="5760"/>
+        </w:tabs>
+        <w:ind w:left="5760" w:hanging="360"/>
+      </w:pPr>
+    </w:lvl>
+    <w:lvl w:ilvl="8" w:tentative="1">
+      <w:start w:val="1"/>
+      <w:numFmt w:val="decimal"/>
+      <w:lvlText w:val="%9."/>
+      <w:lvlJc w:val="left"/>
+      <w:pPr>
+        <w:tabs>
+          <w:tab w:val="num" w:pos="6480"/>
+        </w:tabs>
+        <w:ind w:left="6480" w:hanging="360"/>
+      </w:pPr>
+    </w:lvl>
+  </w:abstractNum>
+  <w:abstractNum w:abstractNumId="6" w15:restartNumberingAfterBreak="0">
+    <w:nsid w:val="518F27A1"/>
+    <w:multiLevelType w:val="multilevel"/>
+    <w:tmpl w:val="0B7C1224"/>
+    <w:lvl w:ilvl="0">
+      <w:start w:val="1"/>
+      <w:numFmt w:val="bullet"/>
+      <w:lvlText w:val=""/>
+      <w:lvlJc w:val="left"/>
+      <w:pPr>
+        <w:tabs>
+          <w:tab w:val="num" w:pos="720"/>
+        </w:tabs>
+        <w:ind w:left="720" w:hanging="360"/>
+      </w:pPr>
+      <w:rPr>
+        <w:rFonts w:ascii="Symbol" w:hAnsi="Symbol" w:hint="default"/>
+        <w:sz w:val="20"/>
+      </w:rPr>
+    </w:lvl>
+    <w:lvl w:ilvl="1" w:tentative="1">
+      <w:start w:val="1"/>
+      <w:numFmt w:val="bullet"/>
+      <w:lvlText w:val="o"/>
+      <w:lvlJc w:val="left"/>
+      <w:pPr>
+        <w:tabs>
+          <w:tab w:val="num" w:pos="1440"/>
+        </w:tabs>
+        <w:ind w:left="1440" w:hanging="360"/>
+      </w:pPr>
+      <w:rPr>
+        <w:rFonts w:ascii="Courier New" w:hAnsi="Courier New" w:hint="default"/>
+        <w:sz w:val="20"/>
+      </w:rPr>
+    </w:lvl>
+    <w:lvl w:ilvl="2" w:tentative="1">
+      <w:start w:val="1"/>
+      <w:numFmt w:val="bullet"/>
+      <w:lvlText w:val=""/>
+      <w:lvlJc w:val="left"/>
+      <w:pPr>
+        <w:tabs>
+          <w:tab w:val="num" w:pos="2160"/>
+        </w:tabs>
+        <w:ind w:left="2160" w:hanging="360"/>
+      </w:pPr>
+      <w:rPr>
+        <w:rFonts w:ascii="Wingdings" w:hAnsi="Wingdings" w:hint="default"/>
+        <w:sz w:val="20"/>
+      </w:rPr>
+    </w:lvl>
+    <w:lvl w:ilvl="3" w:tentative="1">
+      <w:start w:val="1"/>
+      <w:numFmt w:val="bullet"/>
+      <w:lvlText w:val=""/>
+      <w:lvlJc w:val="left"/>
+      <w:pPr>
+        <w:tabs>
+          <w:tab w:val="num" w:pos="2880"/>
+        </w:tabs>
+        <w:ind w:left="2880" w:hanging="360"/>
+      </w:pPr>
+      <w:rPr>
+        <w:rFonts w:ascii="Wingdings" w:hAnsi="Wingdings" w:hint="default"/>
+        <w:sz w:val="20"/>
+      </w:rPr>
+    </w:lvl>
+    <w:lvl w:ilvl="4" w:tentative="1">
+      <w:start w:val="1"/>
+      <w:numFmt w:val="bullet"/>
+      <w:lvlText w:val=""/>
+      <w:lvlJc w:val="left"/>
+      <w:pPr>
+        <w:tabs>
+          <w:tab w:val="num" w:pos="3600"/>
+        </w:tabs>
+        <w:ind w:left="3600" w:hanging="360"/>
+      </w:pPr>
+      <w:rPr>
+        <w:rFonts w:ascii="Wingdings" w:hAnsi="Wingdings" w:hint="default"/>
+        <w:sz w:val="20"/>
+      </w:rPr>
+    </w:lvl>
+    <w:lvl w:ilvl="5" w:tentative="1">
+      <w:start w:val="1"/>
+      <w:numFmt w:val="bullet"/>
+      <w:lvlText w:val=""/>
+      <w:lvlJc w:val="left"/>
+      <w:pPr>
+        <w:tabs>
+          <w:tab w:val="num" w:pos="4320"/>
+        </w:tabs>
+        <w:ind w:left="4320" w:hanging="360"/>
+      </w:pPr>
+      <w:rPr>
+        <w:rFonts w:ascii="Wingdings" w:hAnsi="Wingdings" w:hint="default"/>
+        <w:sz w:val="20"/>
+      </w:rPr>
+    </w:lvl>
+    <w:lvl w:ilvl="6" w:tentative="1">
+      <w:start w:val="1"/>
+      <w:numFmt w:val="bullet"/>
+      <w:lvlText w:val=""/>
+      <w:lvlJc w:val="left"/>
+      <w:pPr>
+        <w:tabs>
+          <w:tab w:val="num" w:pos="5040"/>
+        </w:tabs>
+        <w:ind w:left="5040" w:hanging="360"/>
+      </w:pPr>
+      <w:rPr>
+        <w:rFonts w:ascii="Wingdings" w:hAnsi="Wingdings" w:hint="default"/>
+        <w:sz w:val="20"/>
+      </w:rPr>
+    </w:lvl>
+    <w:lvl w:ilvl="7" w:tentative="1">
+      <w:start w:val="1"/>
+      <w:numFmt w:val="bullet"/>
+      <w:lvlText w:val=""/>
+      <w:lvlJc w:val="left"/>
+      <w:pPr>
+        <w:tabs>
+          <w:tab w:val="num" w:pos="5760"/>
+        </w:tabs>
+        <w:ind w:left="5760" w:hanging="360"/>
+      </w:pPr>
+      <w:rPr>
+        <w:rFonts w:ascii="Wingdings" w:hAnsi="Wingdings" w:hint="default"/>
+        <w:sz w:val="20"/>
+      </w:rPr>
+    </w:lvl>
+    <w:lvl w:ilvl="8" w:tentative="1">
+      <w:start w:val="1"/>
+      <w:numFmt w:val="bullet"/>
+      <w:lvlText w:val=""/>
+      <w:lvlJc w:val="left"/>
+      <w:pPr>
+        <w:tabs>
+          <w:tab w:val="num" w:pos="6480"/>
+        </w:tabs>
+        <w:ind w:left="6480" w:hanging="360"/>
+      </w:pPr>
+      <w:rPr>
+        <w:rFonts w:ascii="Wingdings" w:hAnsi="Wingdings" w:hint="default"/>
+        <w:sz w:val="20"/>
+      </w:rPr>
+    </w:lvl>
+  </w:abstractNum>
+  <w:abstractNum w:abstractNumId="7" w15:restartNumberingAfterBreak="0">
+    <w:nsid w:val="60AA1EB1"/>
+    <w:multiLevelType w:val="multilevel"/>
+    <w:tmpl w:val="287A12CC"/>
+    <w:lvl w:ilvl="0">
+      <w:start w:val="1"/>
+      <w:numFmt w:val="decimal"/>
+      <w:lvlText w:val="%1."/>
+      <w:lvlJc w:val="left"/>
+      <w:pPr>
+        <w:tabs>
+          <w:tab w:val="num" w:pos="720"/>
+        </w:tabs>
+        <w:ind w:left="720" w:hanging="360"/>
+      </w:pPr>
+    </w:lvl>
+    <w:lvl w:ilvl="1" w:tentative="1">
+      <w:start w:val="1"/>
+      <w:numFmt w:val="decimal"/>
+      <w:lvlText w:val="%2."/>
+      <w:lvlJc w:val="left"/>
+      <w:pPr>
+        <w:tabs>
+          <w:tab w:val="num" w:pos="1440"/>
+        </w:tabs>
+        <w:ind w:left="1440" w:hanging="360"/>
+      </w:pPr>
+    </w:lvl>
+    <w:lvl w:ilvl="2" w:tentative="1">
+      <w:start w:val="1"/>
+      <w:numFmt w:val="decimal"/>
+      <w:lvlText w:val="%3."/>
+      <w:lvlJc w:val="left"/>
+      <w:pPr>
+        <w:tabs>
+          <w:tab w:val="num" w:pos="2160"/>
+        </w:tabs>
+        <w:ind w:left="2160" w:hanging="360"/>
+      </w:pPr>
+    </w:lvl>
+    <w:lvl w:ilvl="3" w:tentative="1">
+      <w:start w:val="1"/>
+      <w:numFmt w:val="decimal"/>
+      <w:lvlText w:val="%4."/>
+      <w:lvlJc w:val="left"/>
+      <w:pPr>
+        <w:tabs>
+          <w:tab w:val="num" w:pos="2880"/>
+        </w:tabs>
+        <w:ind w:left="2880" w:hanging="360"/>
+      </w:pPr>
+    </w:lvl>
+    <w:lvl w:ilvl="4" w:tentative="1">
+      <w:start w:val="1"/>
+      <w:numFmt w:val="decimal"/>
+      <w:lvlText w:val="%5."/>
+      <w:lvlJc w:val="left"/>
+      <w:pPr>
+        <w:tabs>
+          <w:tab w:val="num" w:pos="3600"/>
+        </w:tabs>
+        <w:ind w:left="3600" w:hanging="360"/>
+      </w:pPr>
+    </w:lvl>
+    <w:lvl w:ilvl="5" w:tentative="1">
+      <w:start w:val="1"/>
+      <w:numFmt w:val="decimal"/>
+      <w:lvlText w:val="%6."/>
+      <w:lvlJc w:val="left"/>
+      <w:pPr>
+        <w:tabs>
+          <w:tab w:val="num" w:pos="4320"/>
+        </w:tabs>
+        <w:ind w:left="4320" w:hanging="360"/>
+      </w:pPr>
+    </w:lvl>
+    <w:lvl w:ilvl="6" w:tentative="1">
+      <w:start w:val="1"/>
+      <w:numFmt w:val="decimal"/>
+      <w:lvlText w:val="%7."/>
+      <w:lvlJc w:val="left"/>
+      <w:pPr>
+        <w:tabs>
+          <w:tab w:val="num" w:pos="5040"/>
+        </w:tabs>
+        <w:ind w:left="5040" w:hanging="360"/>
+      </w:pPr>
+    </w:lvl>
+    <w:lvl w:ilvl="7" w:tentative="1">
+      <w:start w:val="1"/>
+      <w:numFmt w:val="decimal"/>
+      <w:lvlText w:val="%8."/>
+      <w:lvlJc w:val="left"/>
+      <w:pPr>
+        <w:tabs>
+          <w:tab w:val="num" w:pos="5760"/>
+        </w:tabs>
+        <w:ind w:left="5760" w:hanging="360"/>
+      </w:pPr>
+    </w:lvl>
+    <w:lvl w:ilvl="8" w:tentative="1">
+      <w:start w:val="1"/>
+      <w:numFmt w:val="decimal"/>
+      <w:lvlText w:val="%9."/>
+      <w:lvlJc w:val="left"/>
+      <w:pPr>
+        <w:tabs>
+          <w:tab w:val="num" w:pos="6480"/>
+        </w:tabs>
+        <w:ind w:left="6480" w:hanging="360"/>
+      </w:pPr>
+    </w:lvl>
+  </w:abstractNum>
+  <w:abstractNum w:abstractNumId="8" w15:restartNumberingAfterBreak="0">
     <w:nsid w:val="63A21C52"/>
     <w:multiLevelType w:val="hybridMultilevel"/>
     <w:tmpl w:val="55446E1A"/>
@@ -9532,7 +11528,120 @@
       </w:rPr>
     </w:lvl>
   </w:abstractNum>
-  <w:abstractNum w:abstractNumId="2" w15:restartNumberingAfterBreak="0">
+  <w:abstractNum w:abstractNumId="9" w15:restartNumberingAfterBreak="0">
+    <w:nsid w:val="742F0604"/>
+    <w:multiLevelType w:val="multilevel"/>
+    <w:tmpl w:val="C8CCCBAE"/>
+    <w:lvl w:ilvl="0">
+      <w:start w:val="1"/>
+      <w:numFmt w:val="decimal"/>
+      <w:lvlText w:val="%1."/>
+      <w:lvlJc w:val="left"/>
+      <w:pPr>
+        <w:tabs>
+          <w:tab w:val="num" w:pos="720"/>
+        </w:tabs>
+        <w:ind w:left="720" w:hanging="360"/>
+      </w:pPr>
+    </w:lvl>
+    <w:lvl w:ilvl="1" w:tentative="1">
+      <w:start w:val="1"/>
+      <w:numFmt w:val="decimal"/>
+      <w:lvlText w:val="%2."/>
+      <w:lvlJc w:val="left"/>
+      <w:pPr>
+        <w:tabs>
+          <w:tab w:val="num" w:pos="1440"/>
+        </w:tabs>
+        <w:ind w:left="1440" w:hanging="360"/>
+      </w:pPr>
+    </w:lvl>
+    <w:lvl w:ilvl="2" w:tentative="1">
+      <w:start w:val="1"/>
+      <w:numFmt w:val="decimal"/>
+      <w:lvlText w:val="%3."/>
+      <w:lvlJc w:val="left"/>
+      <w:pPr>
+        <w:tabs>
+          <w:tab w:val="num" w:pos="2160"/>
+        </w:tabs>
+        <w:ind w:left="2160" w:hanging="360"/>
+      </w:pPr>
+    </w:lvl>
+    <w:lvl w:ilvl="3" w:tentative="1">
+      <w:start w:val="1"/>
+      <w:numFmt w:val="decimal"/>
+      <w:lvlText w:val="%4."/>
+      <w:lvlJc w:val="left"/>
+      <w:pPr>
+        <w:tabs>
+          <w:tab w:val="num" w:pos="2880"/>
+        </w:tabs>
+        <w:ind w:left="2880" w:hanging="360"/>
+      </w:pPr>
+    </w:lvl>
+    <w:lvl w:ilvl="4" w:tentative="1">
+      <w:start w:val="1"/>
+      <w:numFmt w:val="decimal"/>
+      <w:lvlText w:val="%5."/>
+      <w:lvlJc w:val="left"/>
+      <w:pPr>
+        <w:tabs>
+          <w:tab w:val="num" w:pos="3600"/>
+        </w:tabs>
+        <w:ind w:left="3600" w:hanging="360"/>
+      </w:pPr>
+    </w:lvl>
+    <w:lvl w:ilvl="5" w:tentative="1">
+      <w:start w:val="1"/>
+      <w:numFmt w:val="decimal"/>
+      <w:lvlText w:val="%6."/>
+      <w:lvlJc w:val="left"/>
+      <w:pPr>
+        <w:tabs>
+          <w:tab w:val="num" w:pos="4320"/>
+        </w:tabs>
+        <w:ind w:left="4320" w:hanging="360"/>
+      </w:pPr>
+    </w:lvl>
+    <w:lvl w:ilvl="6" w:tentative="1">
+      <w:start w:val="1"/>
+      <w:numFmt w:val="decimal"/>
+      <w:lvlText w:val="%7."/>
+      <w:lvlJc w:val="left"/>
+      <w:pPr>
+        <w:tabs>
+          <w:tab w:val="num" w:pos="5040"/>
+        </w:tabs>
+        <w:ind w:left="5040" w:hanging="360"/>
+      </w:pPr>
+    </w:lvl>
+    <w:lvl w:ilvl="7" w:tentative="1">
+      <w:start w:val="1"/>
+      <w:numFmt w:val="decimal"/>
+      <w:lvlText w:val="%8."/>
+      <w:lvlJc w:val="left"/>
+      <w:pPr>
+        <w:tabs>
+          <w:tab w:val="num" w:pos="5760"/>
+        </w:tabs>
+        <w:ind w:left="5760" w:hanging="360"/>
+      </w:pPr>
+    </w:lvl>
+    <w:lvl w:ilvl="8" w:tentative="1">
+      <w:start w:val="1"/>
+      <w:numFmt w:val="decimal"/>
+      <w:lvlText w:val="%9."/>
+      <w:lvlJc w:val="left"/>
+      <w:pPr>
+        <w:tabs>
+          <w:tab w:val="num" w:pos="6480"/>
+        </w:tabs>
+        <w:ind w:left="6480" w:hanging="360"/>
+      </w:pPr>
+    </w:lvl>
+  </w:abstractNum>
+  <w:abstractNum w:abstractNumId="10" w15:restartNumberingAfterBreak="0">
     <w:nsid w:val="77053D3D"/>
     <w:multiLevelType w:val="hybridMultilevel"/>
     <w:tmpl w:val="518A6A36"/>
@@ -9625,10 +11734,34 @@
     <w:abstractNumId w:val="0"/>
   </w:num>
   <w:num w:numId="2" w16cid:durableId="1089884936">
+    <w:abstractNumId w:val="10"/>
+  </w:num>
+  <w:num w:numId="3" w16cid:durableId="1562523850">
+    <w:abstractNumId w:val="8"/>
+  </w:num>
+  <w:num w:numId="4" w16cid:durableId="786772136">
+    <w:abstractNumId w:val="7"/>
+  </w:num>
+  <w:num w:numId="5" w16cid:durableId="870268836">
+    <w:abstractNumId w:val="6"/>
+  </w:num>
+  <w:num w:numId="6" w16cid:durableId="1953324309">
+    <w:abstractNumId w:val="3"/>
+  </w:num>
+  <w:num w:numId="7" w16cid:durableId="440346061">
     <w:abstractNumId w:val="2"/>
   </w:num>
-  <w:num w:numId="3" w16cid:durableId="1562523850">
+  <w:num w:numId="8" w16cid:durableId="840316462">
+    <w:abstractNumId w:val="9"/>
+  </w:num>
+  <w:num w:numId="9" w16cid:durableId="1841385267">
+    <w:abstractNumId w:val="4"/>
+  </w:num>
+  <w:num w:numId="10" w16cid:durableId="762142381">
     <w:abstractNumId w:val="1"/>
+  </w:num>
+  <w:num w:numId="11" w16cid:durableId="1249970277">
+    <w:abstractNumId w:val="5"/>
   </w:num>
 </w:numbering>
 </file>
@@ -10106,7 +12239,6 @@
     <w:next w:val="Normal"/>
     <w:link w:val="Titre4Car"/>
     <w:uiPriority w:val="9"/>
-    <w:semiHidden/>
     <w:unhideWhenUsed/>
     <w:qFormat/>
     <w:rsid w:val="00B611EA"/>
@@ -10304,7 +12436,6 @@
     <w:basedOn w:val="Policepardfaut"/>
     <w:link w:val="Titre4"/>
     <w:uiPriority w:val="9"/>
-    <w:semiHidden/>
     <w:rsid w:val="00B611EA"/>
     <w:rPr>
       <w:rFonts w:eastAsiaTheme="majorEastAsia" w:cstheme="majorBidi"/>
@@ -10587,7 +12718,6 @@
     <w:name w:val="Normal (Web)"/>
     <w:basedOn w:val="Normal"/>
     <w:uiPriority w:val="99"/>
-    <w:semiHidden/>
     <w:unhideWhenUsed/>
     <w:rsid w:val="007C31EA"/>
     <w:pPr>
@@ -10618,6 +12748,18 @@
     <w:rsid w:val="00A679F3"/>
     <w:rPr>
       <w:color w:val="666666"/>
+    </w:rPr>
+  </w:style>
+  <w:style w:type="character" w:styleId="Accentuationlgre">
+    <w:name w:val="Subtle Emphasis"/>
+    <w:basedOn w:val="Policepardfaut"/>
+    <w:uiPriority w:val="19"/>
+    <w:qFormat/>
+    <w:rsid w:val="00475ADF"/>
+    <w:rPr>
+      <w:i/>
+      <w:iCs/>
+      <w:color w:val="404040" w:themeColor="text1" w:themeTint="BF"/>
     </w:rPr>
   </w:style>
 </w:styles>

</xml_diff>